<commit_message>
Simplified DB restore to one script to run
</commit_message>
<xml_diff>
--- a/docs/Lady-Nelson-Sailings-Manual.docx
+++ b/docs/Lady-Nelson-Sailings-Manual.docx
@@ -10955,7 +10955,7 @@
     </w:p>
     <w:bookmarkEnd w:id="83"/>
     <w:bookmarkEnd w:id="84"/>
-    <w:bookmarkStart w:id="97" w:name="chap-40"/>
+    <w:bookmarkStart w:id="99" w:name="chap-40"/>
     <w:p>
       <w:pPr>
         <w:pStyle w:val="Heading1"/>
@@ -12442,7 +12442,7 @@
       </w:r>
     </w:p>
     <w:bookmarkEnd w:id="92"/>
-    <w:bookmarkStart w:id="95" w:name="Xe70efeb2cfe82632dc995dd72bed24536523c2f"/>
+    <w:bookmarkStart w:id="97" w:name="Xe70efeb2cfe82632dc995dd72bed24536523c2f"/>
     <w:p>
       <w:pPr>
         <w:pStyle w:val="Heading2"/>
@@ -12516,13 +12516,314 @@
         <w:t xml:space="preserve">) with your actual destination! Think before you paste!</w:t>
       </w:r>
     </w:p>
-    <w:bookmarkStart w:id="93" w:name="step-by-step"/>
+    <w:bookmarkStart w:id="94" w:name="the-single-command-way"/>
     <w:p>
       <w:pPr>
         <w:pStyle w:val="Heading3"/>
       </w:pPr>
       <w:r>
-        <w:t xml:space="preserve">Step by step</w:t>
+        <w:t xml:space="preserve">The single-command way</w:t>
+      </w:r>
+    </w:p>
+    <w:p>
+      <w:pPr>
+        <w:pStyle w:val="FirstParagraph"/>
+      </w:pPr>
+      <w:r>
+        <w:t xml:space="preserve">For the common case, use the wrapper — one command, run entirely from your</w:t>
+      </w:r>
+      <w:r>
+        <w:t xml:space="preserve"> </w:t>
+      </w:r>
+      <w:r>
+        <w:t xml:space="preserve">workstation, that stops the app, restores the primary database inside a one-off</w:t>
+      </w:r>
+      <w:r>
+        <w:t xml:space="preserve"> </w:t>
+      </w:r>
+      <w:r>
+        <w:t xml:space="preserve">container, and boots the app again:</w:t>
+      </w:r>
+    </w:p>
+    <w:p>
+      <w:pPr>
+        <w:pStyle w:val="SourceCode"/>
+      </w:pPr>
+      <w:r>
+        <w:rPr>
+          <w:rStyle w:val="ExtensionTok"/>
+        </w:rPr>
+        <w:t xml:space="preserve">bin/kamal-restore</w:t>
+      </w:r>
+      <w:r>
+        <w:rPr>
+          <w:rStyle w:val="NormalTok"/>
+        </w:rPr>
+        <w:t xml:space="preserve"> </w:t>
+      </w:r>
+      <w:r>
+        <w:rPr>
+          <w:rStyle w:val="OperatorTok"/>
+        </w:rPr>
+        <w:t xml:space="preserve">&lt;</w:t>
+      </w:r>
+      <w:r>
+        <w:rPr>
+          <w:rStyle w:val="NormalTok"/>
+        </w:rPr>
+        <w:t xml:space="preserve">destination</w:t>
+      </w:r>
+      <w:r>
+        <w:rPr>
+          <w:rStyle w:val="OperatorTok"/>
+        </w:rPr>
+        <w:t xml:space="preserve">&gt;</w:t>
+      </w:r>
+      <w:r>
+        <w:rPr>
+          <w:rStyle w:val="NormalTok"/>
+        </w:rPr>
+        <w:t xml:space="preserve">      </w:t>
+      </w:r>
+      <w:r>
+        <w:rPr>
+          <w:rStyle w:val="CommentTok"/>
+        </w:rPr>
+        <w:t xml:space="preserve"># e.g. staging | prod | raspi | IP</w:t>
+      </w:r>
+    </w:p>
+    <w:p>
+      <w:pPr>
+        <w:pStyle w:val="FirstParagraph"/>
+      </w:pPr>
+      <w:r>
+        <w:t xml:space="preserve">Because it is destructive, it first asks you to confirm by re-typing the</w:t>
+      </w:r>
+      <w:r>
+        <w:t xml:space="preserve"> </w:t>
+      </w:r>
+      <w:r>
+        <w:t xml:space="preserve">destination, then runs the manual steps below for you. There is no switching</w:t>
+      </w:r>
+      <w:r>
+        <w:t xml:space="preserve"> </w:t>
+      </w:r>
+      <w:r>
+        <w:t xml:space="preserve">between workstation and container: the workstation drives Kamal, while the</w:t>
+      </w:r>
+      <w:r>
+        <w:t xml:space="preserve"> </w:t>
+      </w:r>
+      <w:r>
+        <w:t xml:space="preserve">in-container restore is done by</w:t>
+      </w:r>
+      <w:r>
+        <w:t xml:space="preserve"> </w:t>
+      </w:r>
+      <w:hyperlink r:id="rId93">
+        <w:r>
+          <w:rPr>
+            <w:rStyle w:val="VerbatimChar"/>
+          </w:rPr>
+          <w:t xml:space="preserve">bin/restore-primary-db</w:t>
+        </w:r>
+      </w:hyperlink>
+      <w:r>
+        <w:t xml:space="preserve">,</w:t>
+      </w:r>
+      <w:r>
+        <w:t xml:space="preserve"> </w:t>
+      </w:r>
+      <w:r>
+        <w:t xml:space="preserve">which ships inside the image and already carries the credentials it needs. If the</w:t>
+      </w:r>
+      <w:r>
+        <w:t xml:space="preserve"> </w:t>
+      </w:r>
+      <w:r>
+        <w:t xml:space="preserve">restore step fails, the wrapper leaves the app stopped and preserves the old</w:t>
+      </w:r>
+      <w:r>
+        <w:t xml:space="preserve"> </w:t>
+      </w:r>
+      <w:r>
+        <w:t xml:space="preserve">database as</w:t>
+      </w:r>
+      <w:r>
+        <w:t xml:space="preserve"> </w:t>
+      </w:r>
+      <w:r>
+        <w:rPr>
+          <w:rStyle w:val="VerbatimChar"/>
+        </w:rPr>
+        <w:t xml:space="preserve">*.bak-&lt;timestamp&gt;</w:t>
+      </w:r>
+      <w:r>
+        <w:t xml:space="preserve"> </w:t>
+      </w:r>
+      <w:r>
+        <w:t xml:space="preserve">so you can investigate before booting.</w:t>
+      </w:r>
+    </w:p>
+    <w:p>
+      <w:pPr>
+        <w:pStyle w:val="BodyText"/>
+      </w:pPr>
+      <w:r>
+        <w:rPr>
+          <w:b/>
+          <w:bCs/>
+        </w:rPr>
+        <w:t xml:space="preserve">Restoring onto a new server?</w:t>
+      </w:r>
+      <w:r>
+        <w:t xml:space="preserve"> </w:t>
+      </w:r>
+      <w:r>
+        <w:t xml:space="preserve">Deploy first so the image and environment exist,</w:t>
+      </w:r>
+      <w:r>
+        <w:t xml:space="preserve"> </w:t>
+      </w:r>
+      <w:r>
+        <w:t xml:space="preserve">then restore:</w:t>
+      </w:r>
+    </w:p>
+    <w:p>
+      <w:pPr>
+        <w:pStyle w:val="SourceCode"/>
+      </w:pPr>
+      <w:r>
+        <w:rPr>
+          <w:rStyle w:val="ExtensionTok"/>
+        </w:rPr>
+        <w:t xml:space="preserve">bin/kamal</w:t>
+      </w:r>
+      <w:r>
+        <w:rPr>
+          <w:rStyle w:val="NormalTok"/>
+        </w:rPr>
+        <w:t xml:space="preserve"> deploy </w:t>
+      </w:r>
+      <w:r>
+        <w:rPr>
+          <w:rStyle w:val="AttributeTok"/>
+        </w:rPr>
+        <w:t xml:space="preserve">-d</w:t>
+      </w:r>
+      <w:r>
+        <w:rPr>
+          <w:rStyle w:val="NormalTok"/>
+        </w:rPr>
+        <w:t xml:space="preserve"> </w:t>
+      </w:r>
+      <w:r>
+        <w:rPr>
+          <w:rStyle w:val="OperatorTok"/>
+        </w:rPr>
+        <w:t xml:space="preserve">&lt;</w:t>
+      </w:r>
+      <w:r>
+        <w:rPr>
+          <w:rStyle w:val="NormalTok"/>
+        </w:rPr>
+        <w:t xml:space="preserve">destination</w:t>
+      </w:r>
+      <w:r>
+        <w:rPr>
+          <w:rStyle w:val="OperatorTok"/>
+        </w:rPr>
+        <w:t xml:space="preserve">&gt;</w:t>
+      </w:r>
+      <w:r>
+        <w:rPr>
+          <w:rStyle w:val="NormalTok"/>
+        </w:rPr>
+        <w:t xml:space="preserve">    </w:t>
+      </w:r>
+      <w:r>
+        <w:rPr>
+          <w:rStyle w:val="CommentTok"/>
+        </w:rPr>
+        <w:t xml:space="preserve"># first boot creates an empty database</w:t>
+      </w:r>
+      <w:r>
+        <w:br/>
+      </w:r>
+      <w:r>
+        <w:rPr>
+          <w:rStyle w:val="ExtensionTok"/>
+        </w:rPr>
+        <w:t xml:space="preserve">bin/kamal-restore</w:t>
+      </w:r>
+      <w:r>
+        <w:rPr>
+          <w:rStyle w:val="NormalTok"/>
+        </w:rPr>
+        <w:t xml:space="preserve"> </w:t>
+      </w:r>
+      <w:r>
+        <w:rPr>
+          <w:rStyle w:val="OperatorTok"/>
+        </w:rPr>
+        <w:t xml:space="preserve">&lt;</w:t>
+      </w:r>
+      <w:r>
+        <w:rPr>
+          <w:rStyle w:val="NormalTok"/>
+        </w:rPr>
+        <w:t xml:space="preserve">destination</w:t>
+      </w:r>
+      <w:r>
+        <w:rPr>
+          <w:rStyle w:val="OperatorTok"/>
+        </w:rPr>
+        <w:t xml:space="preserve">&gt;</w:t>
+      </w:r>
+      <w:r>
+        <w:rPr>
+          <w:rStyle w:val="NormalTok"/>
+        </w:rPr>
+        <w:t xml:space="preserve">      </w:t>
+      </w:r>
+      <w:r>
+        <w:rPr>
+          <w:rStyle w:val="CommentTok"/>
+        </w:rPr>
+        <w:t xml:space="preserve"># replace it with the backup</w:t>
+      </w:r>
+    </w:p>
+    <w:bookmarkEnd w:id="94"/>
+    <w:bookmarkStart w:id="95" w:name="X940c024996d51a21de9ff9f27681c1873dfba45"/>
+    <w:p>
+      <w:pPr>
+        <w:pStyle w:val="Heading3"/>
+      </w:pPr>
+      <w:r>
+        <w:t xml:space="preserve">What it does, step by step (or how to restore by hand)</w:t>
+      </w:r>
+    </w:p>
+    <w:p>
+      <w:pPr>
+        <w:pStyle w:val="FirstParagraph"/>
+      </w:pPr>
+      <w:r>
+        <w:rPr>
+          <w:rStyle w:val="VerbatimChar"/>
+        </w:rPr>
+        <w:t xml:space="preserve">bin/kamal-restore</w:t>
+      </w:r>
+      <w:r>
+        <w:t xml:space="preserve"> </w:t>
+      </w:r>
+      <w:r>
+        <w:t xml:space="preserve">automates exactly the steps below; follow them by hand only</w:t>
+      </w:r>
+      <w:r>
+        <w:t xml:space="preserve"> </w:t>
+      </w:r>
+      <w:r>
+        <w:t xml:space="preserve">if you need to intervene partway through the sequence.</w:t>
       </w:r>
     </w:p>
     <w:p>
@@ -13231,8 +13532,8 @@
         <w:t xml:space="preserve">).</w:t>
       </w:r>
     </w:p>
-    <w:bookmarkEnd w:id="93"/>
-    <w:bookmarkStart w:id="94" w:name="after-a-restore"/>
+    <w:bookmarkEnd w:id="95"/>
+    <w:bookmarkStart w:id="96" w:name="after-a-restore"/>
     <w:p>
       <w:pPr>
         <w:pStyle w:val="Heading3"/>
@@ -13324,9 +13625,9 @@
         </w:pict>
       </w:r>
     </w:p>
-    <w:bookmarkEnd w:id="94"/>
-    <w:bookmarkEnd w:id="95"/>
-    <w:bookmarkStart w:id="96" w:name="X3469e11603b01e22219ae0f7ce6b30019b627a1"/>
+    <w:bookmarkEnd w:id="96"/>
+    <w:bookmarkEnd w:id="97"/>
+    <w:bookmarkStart w:id="98" w:name="X3469e11603b01e22219ae0f7ce6b30019b627a1"/>
     <w:p>
       <w:pPr>
         <w:pStyle w:val="Heading2"/>
@@ -13477,9 +13778,9 @@
         </w:r>
       </w:hyperlink>
     </w:p>
-    <w:bookmarkEnd w:id="96"/>
-    <w:bookmarkEnd w:id="97"/>
-    <w:bookmarkStart w:id="107" w:name="chap-50"/>
+    <w:bookmarkEnd w:id="98"/>
+    <w:bookmarkEnd w:id="99"/>
+    <w:bookmarkStart w:id="109" w:name="chap-50"/>
     <w:p>
       <w:pPr>
         <w:pStyle w:val="Heading1"/>
@@ -13554,7 +13855,7 @@
         </w:pict>
       </w:r>
     </w:p>
-    <w:bookmarkStart w:id="99" w:name="X1180c4ba3eeff452492cb594ba7f0d29a1bc9a1"/>
+    <w:bookmarkStart w:id="101" w:name="X1180c4ba3eeff452492cb594ba7f0d29a1bc9a1"/>
     <w:p>
       <w:pPr>
         <w:pStyle w:val="Heading2"/>
@@ -13725,7 +14026,7 @@
       <w:r>
         <w:t xml:space="preserve"> </w:t>
       </w:r>
-      <w:hyperlink r:id="rId98">
+      <w:hyperlink r:id="rId100">
         <w:r>
           <w:rPr>
             <w:rStyle w:val="VerbatimChar"/>
@@ -13947,8 +14248,8 @@
         </w:pict>
       </w:r>
     </w:p>
-    <w:bookmarkEnd w:id="99"/>
-    <w:bookmarkStart w:id="101" w:name="X66da68a3ed3a6fe52149fa25a0c9e84b06993c7"/>
+    <w:bookmarkEnd w:id="101"/>
+    <w:bookmarkStart w:id="103" w:name="X66da68a3ed3a6fe52149fa25a0c9e84b06993c7"/>
     <w:p>
       <w:pPr>
         <w:pStyle w:val="Heading2"/>
@@ -14163,7 +14464,7 @@
         <w:t xml:space="preserve">request. Because health checks are silenced, the log is mostly real traffic and errors.</w:t>
       </w:r>
     </w:p>
-    <w:bookmarkStart w:id="100" w:name="turning-up-the-detail-temporarily"/>
+    <w:bookmarkStart w:id="102" w:name="turning-up-the-detail-temporarily"/>
     <w:p>
       <w:pPr>
         <w:pStyle w:val="Heading3"/>
@@ -14293,9 +14594,9 @@
         </w:pict>
       </w:r>
     </w:p>
-    <w:bookmarkEnd w:id="100"/>
-    <w:bookmarkEnd w:id="101"/>
-    <w:bookmarkStart w:id="102" w:name="Xdf1b14e8e37666a311fc27651751fc74a8a9e07"/>
+    <w:bookmarkEnd w:id="102"/>
+    <w:bookmarkEnd w:id="103"/>
+    <w:bookmarkStart w:id="104" w:name="Xdf1b14e8e37666a311fc27651751fc74a8a9e07"/>
     <w:p>
       <w:pPr>
         <w:pStyle w:val="Heading2"/>
@@ -14522,8 +14823,8 @@
         </w:pict>
       </w:r>
     </w:p>
-    <w:bookmarkEnd w:id="102"/>
-    <w:bookmarkStart w:id="104" w:name="Xf55cbeaaa9bd366fee64d2b1169e1983f600531"/>
+    <w:bookmarkEnd w:id="104"/>
+    <w:bookmarkStart w:id="106" w:name="Xf55cbeaaa9bd366fee64d2b1169e1983f600531"/>
     <w:p>
       <w:pPr>
         <w:pStyle w:val="Heading2"/>
@@ -14609,7 +14910,7 @@
       <w:r>
         <w:t xml:space="preserve"> </w:t>
       </w:r>
-      <w:hyperlink r:id="rId103">
+      <w:hyperlink r:id="rId105">
         <w:r>
           <w:rPr>
             <w:rStyle w:val="VerbatimChar"/>
@@ -14909,8 +15210,8 @@
         </w:pict>
       </w:r>
     </w:p>
-    <w:bookmarkEnd w:id="104"/>
-    <w:bookmarkStart w:id="105" w:name="Xc6c24256a33f7fc830ba097a97413c6dcc08fd3"/>
+    <w:bookmarkEnd w:id="106"/>
+    <w:bookmarkStart w:id="107" w:name="Xc6c24256a33f7fc830ba097a97413c6dcc08fd3"/>
     <w:p>
       <w:pPr>
         <w:pStyle w:val="Heading2"/>
@@ -15054,8 +15355,8 @@
         </w:pict>
       </w:r>
     </w:p>
-    <w:bookmarkEnd w:id="105"/>
-    <w:bookmarkStart w:id="106" w:name="X02f53e1bd5dec74d133cbb2d090cbd2805a45b9"/>
+    <w:bookmarkEnd w:id="107"/>
+    <w:bookmarkStart w:id="108" w:name="X02f53e1bd5dec74d133cbb2d090cbd2805a45b9"/>
     <w:p>
       <w:pPr>
         <w:pStyle w:val="Heading2"/>
@@ -15414,9 +15715,9 @@
         </w:r>
       </w:hyperlink>
     </w:p>
-    <w:bookmarkEnd w:id="106"/>
-    <w:bookmarkEnd w:id="107"/>
-    <w:bookmarkStart w:id="120" w:name="chap-60"/>
+    <w:bookmarkEnd w:id="108"/>
+    <w:bookmarkEnd w:id="109"/>
+    <w:bookmarkStart w:id="122" w:name="chap-60"/>
     <w:p>
       <w:pPr>
         <w:pStyle w:val="Heading1"/>
@@ -15474,7 +15775,7 @@
         </w:pict>
       </w:r>
     </w:p>
-    <w:bookmarkStart w:id="108" w:name="X2e49953d570d646755fa1a1e34a73efac08cc5f"/>
+    <w:bookmarkStart w:id="110" w:name="X2e49953d570d646755fa1a1e34a73efac08cc5f"/>
     <w:p>
       <w:pPr>
         <w:pStyle w:val="Heading2"/>
@@ -15710,8 +16011,8 @@
         </w:pict>
       </w:r>
     </w:p>
-    <w:bookmarkEnd w:id="108"/>
-    <w:bookmarkStart w:id="109" w:name="Xbca78df517dfeb4a475c85f2b30272e79b4c2ce"/>
+    <w:bookmarkEnd w:id="110"/>
+    <w:bookmarkStart w:id="111" w:name="Xbca78df517dfeb4a475c85f2b30272e79b4c2ce"/>
     <w:p>
       <w:pPr>
         <w:pStyle w:val="Heading2"/>
@@ -16134,8 +16435,8 @@
         </w:pict>
       </w:r>
     </w:p>
-    <w:bookmarkEnd w:id="109"/>
-    <w:bookmarkStart w:id="110" w:name="Xfc5dfa916ce4b662824612c6db538ea98f3963a"/>
+    <w:bookmarkEnd w:id="111"/>
+    <w:bookmarkStart w:id="112" w:name="Xfc5dfa916ce4b662824612c6db538ea98f3963a"/>
     <w:p>
       <w:pPr>
         <w:pStyle w:val="Heading2"/>
@@ -16437,8 +16738,8 @@
         </w:pict>
       </w:r>
     </w:p>
-    <w:bookmarkEnd w:id="110"/>
-    <w:bookmarkStart w:id="111" w:name="X8bc1a917809398ef8f5f2c21808601cdc0b4ad0"/>
+    <w:bookmarkEnd w:id="112"/>
+    <w:bookmarkStart w:id="113" w:name="X8bc1a917809398ef8f5f2c21808601cdc0b4ad0"/>
     <w:p>
       <w:pPr>
         <w:pStyle w:val="Heading2"/>
@@ -16685,8 +16986,8 @@
         </w:pict>
       </w:r>
     </w:p>
-    <w:bookmarkEnd w:id="111"/>
-    <w:bookmarkStart w:id="113" w:name="Xd3d5220f0f8df7b8fd1ccc0a5653367659d668b"/>
+    <w:bookmarkEnd w:id="113"/>
+    <w:bookmarkStart w:id="115" w:name="Xd3d5220f0f8df7b8fd1ccc0a5653367659d668b"/>
     <w:p>
       <w:pPr>
         <w:pStyle w:val="Heading2"/>
@@ -16753,7 +17054,7 @@
       <w:r>
         <w:t xml:space="preserve"> </w:t>
       </w:r>
-      <w:hyperlink r:id="rId112">
+      <w:hyperlink r:id="rId114">
         <w:r>
           <w:rPr>
             <w:rStyle w:val="VerbatimChar"/>
@@ -17072,8 +17373,8 @@
         </w:pict>
       </w:r>
     </w:p>
-    <w:bookmarkEnd w:id="113"/>
-    <w:bookmarkStart w:id="114" w:name="Xc6315cf0e8e21b8d73826f99530ab158fdbe7f2"/>
+    <w:bookmarkEnd w:id="115"/>
+    <w:bookmarkStart w:id="116" w:name="Xc6315cf0e8e21b8d73826f99530ab158fdbe7f2"/>
     <w:p>
       <w:pPr>
         <w:pStyle w:val="Heading2"/>
@@ -17316,8 +17617,8 @@
         </w:pict>
       </w:r>
     </w:p>
-    <w:bookmarkEnd w:id="114"/>
-    <w:bookmarkStart w:id="116" w:name="Xdaa609fc590682a586bebd1fb6eec08d61f7383"/>
+    <w:bookmarkEnd w:id="116"/>
+    <w:bookmarkStart w:id="118" w:name="Xdaa609fc590682a586bebd1fb6eec08d61f7383"/>
     <w:p>
       <w:pPr>
         <w:pStyle w:val="Heading2"/>
@@ -17400,7 +17701,7 @@
       <w:r>
         <w:t xml:space="preserve"> </w:t>
       </w:r>
-      <w:hyperlink r:id="rId115">
+      <w:hyperlink r:id="rId117">
         <w:r>
           <w:rPr>
             <w:rStyle w:val="VerbatimChar"/>
@@ -17631,8 +17932,8 @@
         </w:pict>
       </w:r>
     </w:p>
-    <w:bookmarkEnd w:id="116"/>
-    <w:bookmarkStart w:id="117" w:name="X5a1d7bfa093d514361ea8c8138f0e91d3e10d04"/>
+    <w:bookmarkEnd w:id="118"/>
+    <w:bookmarkStart w:id="119" w:name="X5a1d7bfa093d514361ea8c8138f0e91d3e10d04"/>
     <w:p>
       <w:pPr>
         <w:pStyle w:val="Heading2"/>
@@ -17800,8 +18101,8 @@
         </w:pict>
       </w:r>
     </w:p>
-    <w:bookmarkEnd w:id="117"/>
-    <w:bookmarkStart w:id="118" w:name="X98a92f9359d950f14170f9ed090568336ea6af8"/>
+    <w:bookmarkEnd w:id="119"/>
+    <w:bookmarkStart w:id="120" w:name="X98a92f9359d950f14170f9ed090568336ea6af8"/>
     <w:p>
       <w:pPr>
         <w:pStyle w:val="Heading2"/>
@@ -17954,8 +18255,8 @@
         </w:pict>
       </w:r>
     </w:p>
-    <w:bookmarkEnd w:id="118"/>
-    <w:bookmarkStart w:id="119" w:name="X6cd360ffbbdc6097fec701a106248e941589868"/>
+    <w:bookmarkEnd w:id="120"/>
+    <w:bookmarkStart w:id="121" w:name="X6cd360ffbbdc6097fec701a106248e941589868"/>
     <w:p>
       <w:pPr>
         <w:pStyle w:val="Heading2"/>
@@ -18108,8 +18409,8 @@
         </w:r>
       </w:hyperlink>
     </w:p>
-    <w:bookmarkEnd w:id="119"/>
-    <w:bookmarkEnd w:id="120"/>
+    <w:bookmarkEnd w:id="121"/>
+    <w:bookmarkEnd w:id="122"/>
     <w:sectPr>
       <w:footnotePr>
         <w:numRestart w:val="eachSect"/>

</xml_diff>

<commit_message>
Added seed_perf.rb and bench.rb to stress test the server and find out how big the DB would get after 7 years
</commit_message>
<xml_diff>
--- a/docs/Lady-Nelson-Sailings-Manual.docx
+++ b/docs/Lady-Nelson-Sailings-Manual.docx
@@ -2573,7 +2573,7 @@
         <w:rPr>
           <w:rStyle w:val="NormalTok"/>
         </w:rPr>
-        <w:t xml:space="preserve"> clone https://github.com/cipaterson/sailings.git</w:t>
+        <w:t xml:space="preserve"> clone https://github.com/USER/sailings.git</w:t>
       </w:r>
       <w:r>
         <w:br/>
@@ -3518,6 +3518,29 @@
       </w:pPr>
       <w:r>
         <w:t xml:space="preserve">2.3 Get the code</w:t>
+      </w:r>
+    </w:p>
+    <w:p>
+      <w:pPr>
+        <w:pStyle w:val="FirstParagraph"/>
+      </w:pPr>
+      <w:r>
+        <w:t xml:space="preserve">Get the code from GitHub. If you are a maintainer, you can replace</w:t>
+      </w:r>
+      <w:r>
+        <w:t xml:space="preserve"> </w:t>
+      </w:r>
+      <w:r>
+        <w:rPr>
+          <w:rStyle w:val="VerbatimChar"/>
+        </w:rPr>
+        <w:t xml:space="preserve">cipaterson</w:t>
+      </w:r>
+      <w:r>
+        <w:t xml:space="preserve"> </w:t>
+      </w:r>
+      <w:r>
+        <w:t xml:space="preserve">with your own username. If you are not, then you should fork the repository first into your own GitHub account, then clone your fork.</w:t>
       </w:r>
     </w:p>
     <w:p>
@@ -8066,7 +8089,7 @@
         <w:rPr>
           <w:rStyle w:val="VerbatimChar"/>
         </w:rPr>
-        <w:t xml:space="preserve">localhost:5555</w:t>
+        <w:t xml:space="preserve">localhost:5005</w:t>
       </w:r>
       <w:r>
         <w:t xml:space="preserve"> </w:t>
@@ -10503,7 +10526,7 @@
         <w:rPr>
           <w:rStyle w:val="VerbatimChar"/>
         </w:rPr>
-        <w:t xml:space="preserve">localhost:5555</w:t>
+        <w:t xml:space="preserve">localhost:5005</w:t>
       </w:r>
       <w:r>
         <w:t xml:space="preserve"> </w:t>
@@ -10704,7 +10727,7 @@
         <w:rPr>
           <w:rStyle w:val="NormalTok"/>
         </w:rPr>
-        <w:t xml:space="preserve">   localhost:5555/staging:8d98cb7ec1bdc3b2174ffe2f4e254618b4655c9c   3 hours ago    Up 3 hours</w:t>
+        <w:t xml:space="preserve">   localhost:5005/staging:8d98cb7ec1bdc3b2174ffe2f4e254618b4655c9c   3 hours ago    Up 3 hours</w:t>
       </w:r>
       <w:r>
         <w:br/>
@@ -10719,7 +10742,7 @@
         <w:rPr>
           <w:rStyle w:val="NormalTok"/>
         </w:rPr>
-        <w:t xml:space="preserve">   localhost:5555/staging:763a123ee82523ca12d32eb06ca35fa7c97e7677   3 hours ago    Exited </w:t>
+        <w:t xml:space="preserve">   localhost:5005/staging:763a123ee82523ca12d32eb06ca35fa7c97e7677   3 hours ago    Exited </w:t>
       </w:r>
       <w:r>
         <w:rPr>
@@ -12603,100 +12626,602 @@
         <w:t xml:space="preserve"> </w:t>
       </w:r>
       <w:r>
-        <w:t xml:space="preserve">destination, then runs the manual steps below for you. There is no switching</w:t>
-      </w:r>
-      <w:r>
-        <w:t xml:space="preserve"> </w:t>
-      </w:r>
-      <w:r>
-        <w:t xml:space="preserve">between workstation and container: the workstation drives Kamal, while the</w:t>
-      </w:r>
-      <w:r>
-        <w:t xml:space="preserve"> </w:t>
-      </w:r>
-      <w:r>
-        <w:t xml:space="preserve">in-container restore is done by</w:t>
-      </w:r>
-      <w:r>
-        <w:t xml:space="preserve"> </w:t>
-      </w:r>
-      <w:hyperlink r:id="rId93">
-        <w:r>
-          <w:rPr>
-            <w:rStyle w:val="VerbatimChar"/>
-          </w:rPr>
-          <w:t xml:space="preserve">bin/restore-primary-db</w:t>
-        </w:r>
-      </w:hyperlink>
-      <w:r>
+        <w:t xml:space="preserve">destination, then runs the manual steps below for you.</w:t>
+      </w:r>
+    </w:p>
+    <w:bookmarkStart w:id="93" w:name="restoring-to-a-point-in-time"/>
+    <w:p>
+      <w:pPr>
+        <w:pStyle w:val="Heading4"/>
+      </w:pPr>
+      <w:r>
+        <w:t xml:space="preserve">Restoring to a point in time</w:t>
+      </w:r>
+    </w:p>
+    <w:p>
+      <w:pPr>
+        <w:pStyle w:val="FirstParagraph"/>
+      </w:pPr>
+      <w:r>
+        <w:t xml:space="preserve">By default the restore uses the</w:t>
+      </w:r>
+      <w:r>
+        <w:t xml:space="preserve"> </w:t>
+      </w:r>
+      <w:r>
+        <w:rPr>
+          <w:b/>
+          <w:bCs/>
+        </w:rPr>
+        <w:t xml:space="preserve">latest</w:t>
+      </w:r>
+      <w:r>
+        <w:t xml:space="preserve"> </w:t>
+      </w:r>
+      <w:r>
+        <w:t xml:space="preserve">backup. To rewind to an earlier</w:t>
+      </w:r>
+      <w:r>
+        <w:t xml:space="preserve"> </w:t>
+      </w:r>
+      <w:r>
+        <w:t xml:space="preserve">moment instead (for example, just before a bad bulk edit), pass an RFC3339</w:t>
+      </w:r>
+      <w:r>
+        <w:t xml:space="preserve"> </w:t>
+      </w:r>
+      <w:r>
+        <w:t xml:space="preserve">timestamp as a second argument:</w:t>
+      </w:r>
+    </w:p>
+    <w:p>
+      <w:pPr>
+        <w:pStyle w:val="SourceCode"/>
+      </w:pPr>
+      <w:r>
+        <w:rPr>
+          <w:rStyle w:val="ExtensionTok"/>
+        </w:rPr>
+        <w:t xml:space="preserve">bin/kamal-restore</w:t>
+      </w:r>
+      <w:r>
+        <w:rPr>
+          <w:rStyle w:val="NormalTok"/>
+        </w:rPr>
+        <w:t xml:space="preserve"> </w:t>
+      </w:r>
+      <w:r>
+        <w:rPr>
+          <w:rStyle w:val="OperatorTok"/>
+        </w:rPr>
+        <w:t xml:space="preserve">&lt;</w:t>
+      </w:r>
+      <w:r>
+        <w:rPr>
+          <w:rStyle w:val="NormalTok"/>
+        </w:rPr>
+        <w:t xml:space="preserve">destination</w:t>
+      </w:r>
+      <w:r>
+        <w:rPr>
+          <w:rStyle w:val="OperatorTok"/>
+        </w:rPr>
+        <w:t xml:space="preserve">&gt;</w:t>
+      </w:r>
+      <w:r>
+        <w:rPr>
+          <w:rStyle w:val="NormalTok"/>
+        </w:rPr>
+        <w:t xml:space="preserve"> 2026-07-12T14:30:00Z</w:t>
+      </w:r>
+    </w:p>
+    <w:p>
+      <w:pPr>
+        <w:pStyle w:val="FirstParagraph"/>
+      </w:pPr>
+      <w:r>
+        <w:t xml:space="preserve">The timestamp must fall within the replica’s</w:t>
+      </w:r>
+      <w:r>
+        <w:t xml:space="preserve"> </w:t>
+      </w:r>
+      <w:r>
+        <w:rPr>
+          <w:b/>
+          <w:bCs/>
+        </w:rPr>
+        <w:t xml:space="preserve">retention</w:t>
+      </w:r>
+      <w:r>
+        <w:t xml:space="preserve"> </w:t>
+      </w:r>
+      <w:r>
+        <w:t xml:space="preserve">window</w:t>
+      </w:r>
+      <w:r>
+        <w:t xml:space="preserve"> </w:t>
+      </w:r>
+      <w:r>
+        <w:t xml:space="preserve">(</w:t>
+      </w:r>
+      <w:r>
+        <w:rPr>
+          <w:rStyle w:val="VerbatimChar"/>
+        </w:rPr>
+        <w:t xml:space="preserve">config/litestream.yml</w:t>
+      </w:r>
+      <w:r>
+        <w:t xml:space="preserve">, currently</w:t>
+      </w:r>
+      <w:r>
+        <w:t xml:space="preserve"> </w:t>
+      </w:r>
+      <w:r>
+        <w:rPr>
+          <w:rStyle w:val="VerbatimChar"/>
+        </w:rPr>
+        <w:t xml:space="preserve">720h</w:t>
+      </w:r>
+      <w:r>
+        <w:t xml:space="preserve"> </w:t>
+      </w:r>
+      <w:r>
+        <w:t xml:space="preserve">= 30 days) and within an available</w:t>
+      </w:r>
+      <w:r>
+        <w:t xml:space="preserve"> </w:t>
+      </w:r>
+      <w:r>
+        <w:t xml:space="preserve">generation, or the restore fails. Litestream restores the most recent snapshot</w:t>
+      </w:r>
+      <w:r>
+        <w:t xml:space="preserve"> </w:t>
+      </w:r>
+      <w:r>
+        <w:t xml:space="preserve">taken</w:t>
+      </w:r>
+      <w:r>
+        <w:t xml:space="preserve"> </w:t>
+      </w:r>
+      <w:r>
+        <w:rPr>
+          <w:i/>
+          <w:iCs/>
+        </w:rPr>
+        <w:t xml:space="preserve">before</w:t>
+      </w:r>
+      <w:r>
+        <w:t xml:space="preserve"> </w:t>
+      </w:r>
+      <w:r>
+        <w:t xml:space="preserve">the timestamp and replays the WAL up to that point. You can see</w:t>
+      </w:r>
+      <w:r>
+        <w:t xml:space="preserve"> </w:t>
+      </w:r>
+      <w:r>
+        <w:t xml:space="preserve">what is available to restore to with:</w:t>
+      </w:r>
+    </w:p>
+    <w:p>
+      <w:pPr>
+        <w:pStyle w:val="SourceCode"/>
+      </w:pPr>
+      <w:r>
+        <w:rPr>
+          <w:rStyle w:val="ExtensionTok"/>
+        </w:rPr>
+        <w:t xml:space="preserve">bin/kamal</w:t>
+      </w:r>
+      <w:r>
+        <w:rPr>
+          <w:rStyle w:val="NormalTok"/>
+        </w:rPr>
+        <w:t xml:space="preserve"> app exec </w:t>
+      </w:r>
+      <w:r>
+        <w:rPr>
+          <w:rStyle w:val="AttributeTok"/>
+        </w:rPr>
+        <w:t xml:space="preserve">-d</w:t>
+      </w:r>
+      <w:r>
+        <w:rPr>
+          <w:rStyle w:val="NormalTok"/>
+        </w:rPr>
+        <w:t xml:space="preserve"> </w:t>
+      </w:r>
+      <w:r>
+        <w:rPr>
+          <w:rStyle w:val="OperatorTok"/>
+        </w:rPr>
+        <w:t xml:space="preserve">&lt;</w:t>
+      </w:r>
+      <w:r>
+        <w:rPr>
+          <w:rStyle w:val="NormalTok"/>
+        </w:rPr>
+        <w:t xml:space="preserve">destination</w:t>
+      </w:r>
+      <w:r>
+        <w:rPr>
+          <w:rStyle w:val="OperatorTok"/>
+        </w:rPr>
+        <w:t xml:space="preserve">&gt;</w:t>
+      </w:r>
+      <w:r>
+        <w:rPr>
+          <w:rStyle w:val="NormalTok"/>
+        </w:rPr>
+        <w:t xml:space="preserve"> </w:t>
+      </w:r>
+      <w:r>
+        <w:rPr>
+          <w:rStyle w:val="StringTok"/>
+        </w:rPr>
+        <w:t xml:space="preserve">"bin/rails litestream:snapshots -- --database=/data/production.sqlite3"</w:t>
+      </w:r>
+      <w:r>
+        <w:br/>
+      </w:r>
+      <w:r>
+        <w:rPr>
+          <w:rStyle w:val="ExtensionTok"/>
+        </w:rPr>
+        <w:t xml:space="preserve">bin/kamal</w:t>
+      </w:r>
+      <w:r>
+        <w:rPr>
+          <w:rStyle w:val="NormalTok"/>
+        </w:rPr>
+        <w:t xml:space="preserve"> app exec </w:t>
+      </w:r>
+      <w:r>
+        <w:rPr>
+          <w:rStyle w:val="AttributeTok"/>
+        </w:rPr>
+        <w:t xml:space="preserve">-d</w:t>
+      </w:r>
+      <w:r>
+        <w:rPr>
+          <w:rStyle w:val="NormalTok"/>
+        </w:rPr>
+        <w:t xml:space="preserve"> </w:t>
+      </w:r>
+      <w:r>
+        <w:rPr>
+          <w:rStyle w:val="OperatorTok"/>
+        </w:rPr>
+        <w:t xml:space="preserve">&lt;</w:t>
+      </w:r>
+      <w:r>
+        <w:rPr>
+          <w:rStyle w:val="NormalTok"/>
+        </w:rPr>
+        <w:t xml:space="preserve">destination</w:t>
+      </w:r>
+      <w:r>
+        <w:rPr>
+          <w:rStyle w:val="OperatorTok"/>
+        </w:rPr>
+        <w:t xml:space="preserve">&gt;</w:t>
+      </w:r>
+      <w:r>
+        <w:rPr>
+          <w:rStyle w:val="NormalTok"/>
+        </w:rPr>
+        <w:t xml:space="preserve"> </w:t>
+      </w:r>
+      <w:r>
+        <w:rPr>
+          <w:rStyle w:val="StringTok"/>
+        </w:rPr>
+        <w:t xml:space="preserve">"bin/rails litestream:generations -- --database=/data/production.sqlite3"</w:t>
+      </w:r>
+      <w:r>
+        <w:br/>
+      </w:r>
+      <w:r>
+        <w:rPr>
+          <w:rStyle w:val="KeywordTok"/>
+        </w:rPr>
+        <w:t xml:space="preserve">```</w:t>
+      </w:r>
+      <w:r>
+        <w:rPr>
+          <w:rStyle w:val="NormalTok"/>
+        </w:rPr>
+        <w:t xml:space="preserve"> </w:t>
+      </w:r>
+      <w:r>
+        <w:rPr>
+          <w:rStyle w:val="ExtensionTok"/>
+        </w:rPr>
+        <w:t xml:space="preserve">There</w:t>
+      </w:r>
+      <w:r>
+        <w:rPr>
+          <w:rStyle w:val="NormalTok"/>
+        </w:rPr>
+        <w:t xml:space="preserve"> is no switching</w:t>
+      </w:r>
+      <w:r>
+        <w:br/>
+      </w:r>
+      <w:r>
+        <w:rPr>
+          <w:rStyle w:val="ExtensionTok"/>
+        </w:rPr>
+        <w:t xml:space="preserve">between</w:t>
+      </w:r>
+      <w:r>
+        <w:rPr>
+          <w:rStyle w:val="NormalTok"/>
+        </w:rPr>
+        <w:t xml:space="preserve"> workstation and container: the workstation drives Kamal, while the</w:t>
+      </w:r>
+      <w:r>
+        <w:br/>
+      </w:r>
+      <w:r>
+        <w:rPr>
+          <w:rStyle w:val="ExtensionTok"/>
+        </w:rPr>
+        <w:t xml:space="preserve">in-container</w:t>
+      </w:r>
+      <w:r>
+        <w:rPr>
+          <w:rStyle w:val="NormalTok"/>
+        </w:rPr>
+        <w:t xml:space="preserve"> restore is done by </w:t>
+      </w:r>
+      <w:r>
+        <w:rPr>
+          <w:rStyle w:val="PreprocessorTok"/>
+        </w:rPr>
+        <w:t xml:space="preserve">[</w:t>
+      </w:r>
+      <w:r>
+        <w:rPr>
+          <w:rStyle w:val="SpecialStringTok"/>
+        </w:rPr>
+        <w:t xml:space="preserve">`bin/restore</w:t>
+      </w:r>
+      <w:r>
+        <w:rPr>
+          <w:rStyle w:val="PreprocessorTok"/>
+        </w:rPr>
+        <w:t xml:space="preserve">-</w:t>
+      </w:r>
+      <w:r>
+        <w:rPr>
+          <w:rStyle w:val="SpecialStringTok"/>
+        </w:rPr>
+        <w:t xml:space="preserve">primary</w:t>
+      </w:r>
+      <w:r>
+        <w:rPr>
+          <w:rStyle w:val="PreprocessorTok"/>
+        </w:rPr>
+        <w:t xml:space="preserve">-</w:t>
+      </w:r>
+      <w:r>
+        <w:rPr>
+          <w:rStyle w:val="SpecialStringTok"/>
+        </w:rPr>
+        <w:t xml:space="preserve">db`</w:t>
+      </w:r>
+      <w:r>
+        <w:rPr>
+          <w:rStyle w:val="PreprocessorTok"/>
+        </w:rPr>
+        <w:t xml:space="preserve">]</w:t>
+      </w:r>
+      <w:r>
+        <w:rPr>
+          <w:rStyle w:val="ErrorTok"/>
+        </w:rPr>
+        <w:t xml:space="preserve">(</w:t>
+      </w:r>
+      <w:r>
+        <w:rPr>
+          <w:rStyle w:val="ExtensionTok"/>
+        </w:rPr>
+        <w:t xml:space="preserve">https://github.com/cipaterson/sailings/blob/main/bin/restore-primary-db</w:t>
+      </w:r>
+      <w:r>
+        <w:rPr>
+          <w:rStyle w:val="KeywordTok"/>
+        </w:rPr>
+        <w:t xml:space="preserve">)</w:t>
+      </w:r>
+      <w:r>
+        <w:rPr>
+          <w:rStyle w:val="ExtensionTok"/>
+        </w:rPr>
         <w:t xml:space="preserve">,</w:t>
       </w:r>
       <w:r>
-        <w:t xml:space="preserve"> </w:t>
-      </w:r>
-      <w:r>
-        <w:t xml:space="preserve">which ships inside the image and already carries the credentials it needs. If the</w:t>
-      </w:r>
-      <w:r>
-        <w:t xml:space="preserve"> </w:t>
-      </w:r>
-      <w:r>
-        <w:t xml:space="preserve">restore step fails, the wrapper leaves the app stopped and preserves the old</w:t>
-      </w:r>
-      <w:r>
-        <w:t xml:space="preserve"> </w:t>
-      </w:r>
-      <w:r>
-        <w:t xml:space="preserve">database as</w:t>
-      </w:r>
-      <w:r>
-        <w:t xml:space="preserve"> </w:t>
-      </w:r>
-      <w:r>
-        <w:rPr>
-          <w:rStyle w:val="VerbatimChar"/>
-        </w:rPr>
-        <w:t xml:space="preserve">*.bak-&lt;timestamp&gt;</w:t>
-      </w:r>
-      <w:r>
-        <w:t xml:space="preserve"> </w:t>
-      </w:r>
-      <w:r>
-        <w:t xml:space="preserve">so you can investigate before booting.</w:t>
-      </w:r>
-    </w:p>
-    <w:p>
-      <w:pPr>
-        <w:pStyle w:val="BodyText"/>
-      </w:pPr>
-      <w:r>
-        <w:rPr>
-          <w:b/>
-          <w:bCs/>
-        </w:rPr>
-        <w:t xml:space="preserve">Restoring onto a new server?</w:t>
-      </w:r>
-      <w:r>
-        <w:t xml:space="preserve"> </w:t>
-      </w:r>
-      <w:r>
-        <w:t xml:space="preserve">Deploy first so the image and environment exist,</w:t>
-      </w:r>
-      <w:r>
-        <w:t xml:space="preserve"> </w:t>
-      </w:r>
-      <w:r>
-        <w:t xml:space="preserve">then restore:</w:t>
-      </w:r>
-    </w:p>
-    <w:p>
-      <w:pPr>
-        <w:pStyle w:val="SourceCode"/>
-      </w:pPr>
+        <w:br/>
+      </w:r>
+      <w:r>
+        <w:rPr>
+          <w:rStyle w:val="FunctionTok"/>
+        </w:rPr>
+        <w:t xml:space="preserve">which</w:t>
+      </w:r>
+      <w:r>
+        <w:rPr>
+          <w:rStyle w:val="NormalTok"/>
+        </w:rPr>
+        <w:t xml:space="preserve"> ships inside the image and already carries the credentials it needs. If the</w:t>
+      </w:r>
+      <w:r>
+        <w:br/>
+      </w:r>
       <w:r>
         <w:rPr>
           <w:rStyle w:val="ExtensionTok"/>
         </w:rPr>
+        <w:t xml:space="preserve">restore</w:t>
+      </w:r>
+      <w:r>
+        <w:rPr>
+          <w:rStyle w:val="NormalTok"/>
+        </w:rPr>
+        <w:t xml:space="preserve"> step fails, the wrapper leaves the app stopped and preserves the old</w:t>
+      </w:r>
+      <w:r>
+        <w:br/>
+      </w:r>
+      <w:r>
+        <w:rPr>
+          <w:rStyle w:val="ExtensionTok"/>
+        </w:rPr>
+        <w:t xml:space="preserve">database</w:t>
+      </w:r>
+      <w:r>
+        <w:rPr>
+          <w:rStyle w:val="NormalTok"/>
+        </w:rPr>
+        <w:t xml:space="preserve"> as </w:t>
+      </w:r>
+      <w:r>
+        <w:rPr>
+          <w:rStyle w:val="KeywordTok"/>
+        </w:rPr>
+        <w:t xml:space="preserve">`</w:t>
+      </w:r>
+      <w:r>
+        <w:rPr>
+          <w:rStyle w:val="PreprocessorTok"/>
+        </w:rPr>
+        <w:t xml:space="preserve">*</w:t>
+      </w:r>
+      <w:r>
+        <w:rPr>
+          <w:rStyle w:val="NormalTok"/>
+        </w:rPr>
+        <w:t xml:space="preserve">.bak-</w:t>
+      </w:r>
+      <w:r>
+        <w:rPr>
+          <w:rStyle w:val="OperatorTok"/>
+        </w:rPr>
+        <w:t xml:space="preserve">&lt;</w:t>
+      </w:r>
+      <w:r>
+        <w:rPr>
+          <w:rStyle w:val="NormalTok"/>
+        </w:rPr>
+        <w:t xml:space="preserve">timestamp</w:t>
+      </w:r>
+      <w:r>
+        <w:rPr>
+          <w:rStyle w:val="OperatorTok"/>
+        </w:rPr>
+        <w:t xml:space="preserve">&gt;</w:t>
+      </w:r>
+      <w:r>
+        <w:rPr>
+          <w:rStyle w:val="KeywordTok"/>
+        </w:rPr>
+        <w:t xml:space="preserve">`</w:t>
+      </w:r>
+      <w:r>
+        <w:rPr>
+          <w:rStyle w:val="NormalTok"/>
+        </w:rPr>
+        <w:t xml:space="preserve"> </w:t>
+      </w:r>
+      <w:r>
+        <w:rPr>
+          <w:rStyle w:val="ExtensionTok"/>
+        </w:rPr>
+        <w:t xml:space="preserve">so</w:t>
+      </w:r>
+      <w:r>
+        <w:rPr>
+          <w:rStyle w:val="NormalTok"/>
+        </w:rPr>
+        <w:t xml:space="preserve"> you can investigate before booting.</w:t>
+      </w:r>
+      <w:r>
+        <w:br/>
+      </w:r>
+      <w:r>
+        <w:br/>
+      </w:r>
+      <w:r>
+        <w:rPr>
+          <w:rStyle w:val="ExtensionTok"/>
+        </w:rPr>
+        <w:t xml:space="preserve">**Restoring</w:t>
+      </w:r>
+      <w:r>
+        <w:rPr>
+          <w:rStyle w:val="NormalTok"/>
+        </w:rPr>
+        <w:t xml:space="preserve"> onto a new server</w:t>
+      </w:r>
+      <w:r>
+        <w:rPr>
+          <w:rStyle w:val="PreprocessorTok"/>
+        </w:rPr>
+        <w:t xml:space="preserve">?**</w:t>
+      </w:r>
+      <w:r>
+        <w:rPr>
+          <w:rStyle w:val="NormalTok"/>
+        </w:rPr>
+        <w:t xml:space="preserve"> Deploy first so the image and environment exist,</w:t>
+      </w:r>
+      <w:r>
+        <w:br/>
+      </w:r>
+      <w:r>
+        <w:rPr>
+          <w:rStyle w:val="ControlFlowTok"/>
+        </w:rPr>
+        <w:t xml:space="preserve">then</w:t>
+      </w:r>
+      <w:r>
+        <w:rPr>
+          <w:rStyle w:val="NormalTok"/>
+        </w:rPr>
+        <w:t xml:space="preserve"> </w:t>
+      </w:r>
+      <w:r>
+        <w:rPr>
+          <w:rStyle w:val="ExtensionTok"/>
+        </w:rPr>
+        <w:t xml:space="preserve">restore:</w:t>
+      </w:r>
+      <w:r>
+        <w:br/>
+      </w:r>
+      <w:r>
+        <w:br/>
+      </w:r>
+      <w:r>
+        <w:rPr>
+          <w:rStyle w:val="KeywordTok"/>
+        </w:rPr>
+        <w:t xml:space="preserve">```</w:t>
+      </w:r>
+      <w:r>
+        <w:rPr>
+          <w:rStyle w:val="NormalTok"/>
+        </w:rPr>
+        <w:t xml:space="preserve">bash</w:t>
+      </w:r>
+      <w:r>
+        <w:br/>
+      </w:r>
+      <w:r>
+        <w:rPr>
+          <w:rStyle w:val="ExtensionTok"/>
+        </w:rPr>
         <w:t xml:space="preserve">bin/kamal</w:t>
       </w:r>
       <w:r>
@@ -12793,6 +13318,7 @@
         <w:t xml:space="preserve"># replace it with the backup</w:t>
       </w:r>
     </w:p>
+    <w:bookmarkEnd w:id="93"/>
     <w:bookmarkEnd w:id="94"/>
     <w:bookmarkStart w:id="95" w:name="X940c024996d51a21de9ff9f27681c1873dfba45"/>
     <w:p>
@@ -12817,7 +13343,17 @@
         <w:t xml:space="preserve"> </w:t>
       </w:r>
       <w:r>
-        <w:t xml:space="preserve">automates exactly the steps below; follow them by hand only</w:t>
+        <w:t xml:space="preserve">automates exactly the steps below; follow them by hand</w:t>
+      </w:r>
+      <w:r>
+        <w:t xml:space="preserve"> </w:t>
+      </w:r>
+      <w:r>
+        <w:rPr>
+          <w:b/>
+          <w:bCs/>
+        </w:rPr>
+        <w:t xml:space="preserve">only</w:t>
       </w:r>
       <w:r>
         <w:t xml:space="preserve"> </w:t>
@@ -13345,6 +13881,123 @@
       </w:r>
       <w:r>
         <w:t xml:space="preserve">Litestream finds the location of the replica).</w:t>
+      </w:r>
+    </w:p>
+    <w:p>
+      <w:pPr>
+        <w:numPr>
+          <w:ilvl w:val="0"/>
+          <w:numId w:val="1000"/>
+        </w:numPr>
+      </w:pPr>
+      <w:r>
+        <w:t xml:space="preserve">To restore to a</w:t>
+      </w:r>
+      <w:r>
+        <w:t xml:space="preserve"> </w:t>
+      </w:r>
+      <w:r>
+        <w:rPr>
+          <w:b/>
+          <w:bCs/>
+        </w:rPr>
+        <w:t xml:space="preserve">point in time</w:t>
+      </w:r>
+      <w:r>
+        <w:t xml:space="preserve"> </w:t>
+      </w:r>
+      <w:r>
+        <w:t xml:space="preserve">rather than the latest backup, append an</w:t>
+      </w:r>
+      <w:r>
+        <w:t xml:space="preserve"> </w:t>
+      </w:r>
+      <w:r>
+        <w:t xml:space="preserve">RFC3339</w:t>
+      </w:r>
+      <w:r>
+        <w:t xml:space="preserve"> </w:t>
+      </w:r>
+      <w:r>
+        <w:rPr>
+          <w:rStyle w:val="VerbatimChar"/>
+        </w:rPr>
+        <w:t xml:space="preserve">-timestamp</w:t>
+      </w:r>
+      <w:r>
+        <w:t xml:space="preserve"> </w:t>
+      </w:r>
+      <w:r>
+        <w:t xml:space="preserve">(within the retention window):</w:t>
+      </w:r>
+    </w:p>
+    <w:p>
+      <w:pPr>
+        <w:pStyle w:val="SourceCode"/>
+        <w:numPr>
+          <w:ilvl w:val="0"/>
+          <w:numId w:val="1000"/>
+        </w:numPr>
+      </w:pPr>
+      <w:r>
+        <w:rPr>
+          <w:rStyle w:val="ExtensionTok"/>
+        </w:rPr>
+        <w:t xml:space="preserve">bin/rails</w:t>
+      </w:r>
+      <w:r>
+        <w:rPr>
+          <w:rStyle w:val="NormalTok"/>
+        </w:rPr>
+        <w:t xml:space="preserve"> litestream:restore </w:t>
+      </w:r>
+      <w:r>
+        <w:rPr>
+          <w:rStyle w:val="AttributeTok"/>
+        </w:rPr>
+        <w:t xml:space="preserve">--</w:t>
+      </w:r>
+      <w:r>
+        <w:rPr>
+          <w:rStyle w:val="NormalTok"/>
+        </w:rPr>
+        <w:t xml:space="preserve"> </w:t>
+      </w:r>
+      <w:r>
+        <w:rPr>
+          <w:rStyle w:val="AttributeTok"/>
+        </w:rPr>
+        <w:t xml:space="preserve">--database</w:t>
+      </w:r>
+      <w:r>
+        <w:rPr>
+          <w:rStyle w:val="OperatorTok"/>
+        </w:rPr>
+        <w:t xml:space="preserve">=</w:t>
+      </w:r>
+      <w:r>
+        <w:rPr>
+          <w:rStyle w:val="NormalTok"/>
+        </w:rPr>
+        <w:t xml:space="preserve">/data/production.sqlite3 </w:t>
+      </w:r>
+      <w:r>
+        <w:rPr>
+          <w:rStyle w:val="AttributeTok"/>
+        </w:rPr>
+        <w:t xml:space="preserve">-timestamp</w:t>
+      </w:r>
+      <w:r>
+        <w:rPr>
+          <w:rStyle w:val="OperatorTok"/>
+        </w:rPr>
+        <w:t xml:space="preserve">=</w:t>
+      </w:r>
+      <w:r>
+        <w:rPr>
+          <w:rStyle w:val="NormalTok"/>
+        </w:rPr>
+        <w:t xml:space="preserve">2026-07-12T14:30:00Z</w:t>
       </w:r>
     </w:p>
     <w:p>
@@ -16545,7 +17198,7 @@
         <w:rPr>
           <w:rStyle w:val="VerbatimChar"/>
         </w:rPr>
-        <w:t xml:space="preserve">localhost:5555</w:t>
+        <w:t xml:space="preserve">localhost:5005</w:t>
       </w:r>
       <w:r>
         <w:t xml:space="preserve">; if it is unreachable the push fails. Ensure the local registry is running</w:t>

</xml_diff>